<commit_message>
Merkliste Strang 81-85; Pflegedienste-Dokument aktualisiert
</commit_message>
<xml_diff>
--- a/Anja_Jolk_Leistungsuebersicht_Pflegedienste.docx
+++ b/Anja_Jolk_Leistungsuebersicht_Pflegedienste.docx
@@ -79,7 +79,7 @@
           <w:sz w:val="18"/>
           <w:szCs w:val="18"/>
         </w:rPr>
-        <w:t xml:space="preserve">Ich unterstütze Familien und Seniorinnen und Senioren durch niedrigschwellige Alltagsstrukturierung, administrative Entlastung und Begleitung zu Terminen. Meine Leistungen ergänzen die pflegerischen Angebote Ihres Dienstes sinnvoll, da sie Bereiche abdecken, die nicht in den Pflegeauftrag fallen, aber für viele Ihrer Kundinnen und Kunden wichtig sind.</w:t>
+        <w:t xml:space="preserve">Ich unterstütze Familien und Seniorinnen und Senioren durch niedrigschwellige Alltagsstrukturierung, administrative Entlastung. Meine Leistungen ergänzen die pflegerischen Angebote Ihres Dienstes sinnvoll, da sie Bereiche abdecken, die nicht in den Pflegeauftrag fallen, aber für viele Ihrer Kundinnen und Kunden wichtig sind.</w:t>
       </w:r>
     </w:p>
     <w:p>
@@ -140,18 +140,7 @@
                 <w:sz w:val="16"/>
                 <w:szCs w:val="16"/>
               </w:rPr>
-              <w:t xml:space="preserve">Wichtiger Hinweis: </w:t>
-            </w:r>
-            <w:r>
-              <w:rPr>
-                <w:rFonts w:ascii="Calibri" w:cs="Calibri" w:eastAsia="Calibri" w:hAnsi="Calibri"/>
-                <w:b/>
-                <w:bCs/>
-                <w:color w:val="1A2E44"/>
-                <w:sz w:val="16"/>
-                <w:szCs w:val="16"/>
-              </w:rPr>
-              <w:t xml:space="preserve">Ausfüllhilfe und Strukturgeberin — keine Rechtsberatung.</w:t>
+              <w:t xml:space="preserve">Wichtiger Hinweis: Ausfüllhilfe und Strukturgeberin — keine Rechtsberatung.</w:t>
             </w:r>
           </w:p>
           <w:p>
@@ -466,27 +455,6 @@
           <w:sz w:val="17"/>
           <w:szCs w:val="17"/>
         </w:rPr>
-        <w:t xml:space="preserve">Begleitung zu Arzt, Apotheke, Einkauf</w:t>
-      </w:r>
-    </w:p>
-    <w:p>
-      <w:pPr>
-        <w:pStyle w:val="ListParagraph"/>
-        <w:numPr>
-          <w:ilvl w:val="0"/>
-          <w:numId w:val="1"/>
-        </w:numPr>
-        <w:spacing w:after="16"/>
-      </w:pPr>
-      <w:r>
-        <w:rPr>
-          <w:rFonts w:ascii="Calibri" w:cs="Calibri" w:eastAsia="Calibri" w:hAnsi="Calibri"/>
-          <w:i w:val="false"/>
-          <w:iCs w:val="false"/>
-          <w:color w:val="2B2B2B"/>
-          <w:sz w:val="17"/>
-          <w:szCs w:val="17"/>
-        </w:rPr>
         <w:t xml:space="preserve">Gespräche, Orientierung, Struktur</w:t>
       </w:r>
     </w:p>
@@ -656,7 +624,7 @@
           <w:sz w:val="17"/>
           <w:szCs w:val="17"/>
         </w:rPr>
-        <w:t xml:space="preserve">Entlastung bei Terminen</w:t>
+        <w:t xml:space="preserve">Terminorganisation</w:t>
       </w:r>
     </w:p>
     <w:p>
@@ -1002,7 +970,7 @@
           <w:sz w:val="16"/>
           <w:szCs w:val="16"/>
         </w:rPr>
-        <w:t xml:space="preserve">Anja Jolk · Schwerte  ·  E-Mail: info@klartext-mentoring.de  ·  Telefon: [einfügen]</w:t>
+        <w:t xml:space="preserve">Anja Jolk · Schwerte  ·  E-Mail: info@klartext-mentoring.de  ·  Telefon: +49 176 62311567</w:t>
       </w:r>
     </w:p>
     <w:p>

</xml_diff>